<commit_message>
﻿feat: publicar S04 (Word) + indice do Bloco 2
Pre-publicacao: validacao fria por persona (6/10) aplicada — demo de
ambiguidades movida para depois do Caso #1 (com nota "mesma conversa"),
logistica dual-track completa (OneDrive p/ comando /, copiar so a
seccao), respostas de discussao alinhadas com o exemplo, tabela-resumo
dos 5 sinais (anglicismos ancorados, refs da S05 removidas), caixa
"E na segunda-feira" (PDF/longo/dados pessoais), registo de voz
normalizado, miudezas (password, LabX, "faltam"). Dataset: 2x
"Objecto" pre-AO corrigidos.

Co-Authored-By: Claude Fable 5 <noreply@anthropic.com>
</commit_message>
<xml_diff>
--- a/sessoes/sessao-04/Dataset_S04_Documentos.docx
+++ b/sessoes/sessao-04/Dataset_S04_Documentos.docx
@@ -121,7 +121,7 @@
         <w:pStyle w:val="Heading3"/>
       </w:pPr>
       <w:r>
-        <w:t>Artigo 1.º — Objecto</w:t>
+        <w:t>Artigo 1.º — Objeto</w:t>
       </w:r>
     </w:p>
     <w:p>
@@ -735,7 +735,7 @@
     </w:p>
     <w:p>
       <w:r>
-        <w:t>A questão acima referida não foi ainda objecto de decisão uniformizadora pelo Pleno do STA, encontrando-se actualmente em sede de recurso para uniformização de jurisprudência (Proc. uniformizador n.º 037/24, com despacho de admissão de 11-02-2025), pelo que subsiste, ao momento da emissão do presente parecer, divergência jurisprudencial sobre o regime aplicável.</w:t>
+        <w:t>A questão acima referida não foi ainda objeto de decisão uniformizadora pelo Pleno do STA, encontrando-se actualmente em sede de recurso para uniformização de jurisprudência (Proc. uniformizador n.º 037/24, com despacho de admissão de 11-02-2025), pelo que subsiste, ao momento da emissão do presente parecer, divergência jurisprudencial sobre o regime aplicável.</w:t>
       </w:r>
     </w:p>
     <w:p>

</xml_diff>

<commit_message>
﻿fix: S04 - correcoes do re-score (Tiago 8/10) e do jurista adversarial
JURIDICO (DOC-B): dies a quo corrigido — facto tributario completa-se
no fim do periodo letivo (Ac. STA 4/2015), nao na inscricao; divida
passa para 2016/17 (TS-2017/0421, EUR 840 remanescentes), prescricao
da 1.a leitura em meados de outubro de 2025; art. 49.o/4 alinea a);
divergencia ancorada em jurisprudencia superior analoga (STA 0761/12
e 0920/15) em vez de "primeira instancia". Propagado a pagina e
resolucao do formador.

TIAGO: art. 9.o -> 5.o CPA na tabela do worksheet; P4 duplicada do
Bloco 8 fundida (narrativa + votacao A/B/C); tres falhas do exemplo
do Caso #1 em <details>; nome "inverse prompting" removido.

Co-Authored-By: Claude Fable 5 <noreply@anthropic.com>
</commit_message>
<xml_diff>
--- a/sessoes/sessao-04/Dataset_S04_Documentos.docx
+++ b/sessoes/sessao-04/Dataset_S04_Documentos.docx
@@ -964,7 +964,7 @@
         <w:t xml:space="preserve"> </w:t>
       </w:r>
       <w:r>
-        <w:t xml:space="preserve">Prescrição da obrigação de pagamento de propinas em atraso — caso TS-2018/0421</w:t>
+        <w:t xml:space="preserve">Prescrição da obrigação de pagamento de propinas em atraso — caso TS-2017/0421</w:t>
       </w:r>
     </w:p>
     <w:p>
@@ -988,7 +988,7 @@
         <w:pStyle w:val="FirstParagraph"/>
       </w:pPr>
       <w:r>
-        <w:t xml:space="preserve">Foi solicitado por V. Ex.ª parecer sobre a possibilidade de cobrança coerciva de propinas em atraso relativas ao ano letivo 2017/2018, no valor agregado de €1 050,00 (mil e cinquenta euros), respeitantes ao processo TS-2018/0421, considerando que o estudante subscreveu em 2020 um acordo de regularização da dívida em prestações, que cumpriu apenas parcialmente.</w:t>
+        <w:t xml:space="preserve">Foi solicitado por V. Ex.ª parecer sobre a possibilidade de cobrança coerciva de propinas em atraso relativas ao ano letivo 2016/2017, no valor remanescente de €840,00 (de um total inicial de €1 050,00), respeitantes ao processo TS-2017/0421, considerando que o estudante subscreveu em 2020 um acordo de regularização da dívida em prestações, que cumpriu apenas parcialmente.</w:t>
       </w:r>
     </w:p>
     <w:bookmarkEnd w:id="31"/>
@@ -1059,36 +1059,36 @@
         <w:pStyle w:val="BodyText"/>
       </w:pPr>
       <w:r>
-        <w:t xml:space="preserve">No caso vertente, o facto tributário reporta-se à inscrição no ano letivo 2017/2018, formalizada em</w:t>
-      </w:r>
-      <w:r>
-        <w:t xml:space="preserve"> </w:t>
-      </w:r>
-      <w:r>
-        <w:rPr>
-          <w:b/>
-          <w:bCs/>
-        </w:rPr>
-        <w:t xml:space="preserve">15-09-2017</w:t>
-      </w:r>
-      <w:r>
-        <w:t xml:space="preserve">, pelo que o prazo de oito anos, sem mais, ter-se-ia completado em</w:t>
-      </w:r>
-      <w:r>
-        <w:t xml:space="preserve"> </w:t>
-      </w:r>
-      <w:r>
-        <w:rPr>
-          <w:b/>
-          <w:bCs/>
-        </w:rPr>
-        <w:t xml:space="preserve">15-09-2025</w:t>
-      </w:r>
-      <w:r>
-        <w:t xml:space="preserve"> </w:t>
-      </w:r>
-      <w:r>
-        <w:t xml:space="preserve">— antes da data do presente parecer.</w:t>
+        <w:t xml:space="preserve">No caso vertente, o facto tributário completou-se no termo do período letivo 2016/2017, em</w:t>
+      </w:r>
+      <w:r>
+        <w:t xml:space="preserve"> </w:t>
+      </w:r>
+      <w:r>
+        <w:rPr>
+          <w:b/>
+          <w:bCs/>
+        </w:rPr>
+        <w:t xml:space="preserve">31-07-2017</w:t>
+      </w:r>
+      <w:r>
+        <w:t xml:space="preserve"> </w:t>
+      </w:r>
+      <w:r>
+        <w:t xml:space="preserve">— nos termos do próprio Acórdão n.º 4/2015, o facto tributário substancia-se na frequência do serviço público de ensino e completa-se no último dia do período letivo —, pelo que o prazo de oito anos, sem mais, ter-se-ia completado em</w:t>
+      </w:r>
+      <w:r>
+        <w:t xml:space="preserve"> </w:t>
+      </w:r>
+      <w:r>
+        <w:rPr>
+          <w:b/>
+          <w:bCs/>
+        </w:rPr>
+        <w:t xml:space="preserve">31-07-2025</w:t>
+      </w:r>
+      <w:r>
+        <w:t xml:space="preserve">, antes da data do presente parecer.</w:t>
       </w:r>
     </w:p>
     <w:p>
@@ -1119,7 +1119,7 @@
           <w:b/>
           <w:bCs/>
         </w:rPr>
-        <w:t xml:space="preserve">artigo 49.º, n.º 4, da LGT</w:t>
+        <w:t xml:space="preserve">artigo 49.º, n.º 4, alínea a), da LGT</w:t>
       </w:r>
       <w:r>
         <w:t xml:space="preserve">, o prazo de prescrição suspende-se em virtude de pagamento de prestações legalmente autorizadas — e é na extensão temporal desta suspensão que reside a verdadeira dificuldade do caso:</w:t>
@@ -1146,17 +1146,17 @@
         <w:t xml:space="preserve">primeira leitura</w:t>
       </w:r>
       <w:r>
-        <w:t xml:space="preserve">, a suspensão vale apenas enquanto o plano prestacional foi efetivamente cumprido (de 11-05-2020 a 31-07-2020, cerca de dois meses e meio): o prazo retomou o seu curso com o incumprimento e a prescrição ter-se-ia consumado no</w:t>
-      </w:r>
-      <w:r>
-        <w:t xml:space="preserve"> </w:t>
-      </w:r>
-      <w:r>
-        <w:rPr>
-          <w:b/>
-          <w:bCs/>
-        </w:rPr>
-        <w:t xml:space="preserve">início de dezembro de 2025</w:t>
+        <w:t xml:space="preserve">, a suspensão vale apenas enquanto o plano prestacional foi efetivamente cumprido (de 11-05-2020 a 31-07-2020, cerca de dois meses e meio): o prazo retomou o seu curso com o incumprimento e a prescrição ter-se-ia consumado em</w:t>
+      </w:r>
+      <w:r>
+        <w:t xml:space="preserve"> </w:t>
+      </w:r>
+      <w:r>
+        <w:rPr>
+          <w:b/>
+          <w:bCs/>
+        </w:rPr>
+        <w:t xml:space="preserve">meados de outubro de 2025</w:t>
       </w:r>
       <w:r>
         <w:t xml:space="preserve"> </w:t>
@@ -1207,7 +1207,7 @@
         <w:pStyle w:val="FirstParagraph"/>
       </w:pPr>
       <w:r>
-        <w:t xml:space="preserve">Não se conhece jurisprudência uniformizada sobre a extensão temporal da suspensão do artigo 49.º, n.º 4, da LGT em planos prestacionais incumpridos mas não formalmente extintos, registando-se decisões de primeira instância em ambos os sentidos.</w:t>
+        <w:t xml:space="preserve">Não se conhece jurisprudência uniformizada sobre a extensão temporal da suspensão da alínea a) do n.º 4 do artigo 49.º da LGT em planos prestacionais incumpridos mas não formalmente extintos, extraindo a jurisprudência superior soluções divergentes de regimes prestacionais análogos (cfr. acórdãos do STA de 31-10-2012, proc. 0761/12, e de 24-02-2016, proc. 0920/15).</w:t>
       </w:r>
     </w:p>
     <w:bookmarkEnd w:id="32"/>
@@ -1233,7 +1233,7 @@
         <w:pStyle w:val="BodyText"/>
       </w:pPr>
       <w:r>
-        <w:t xml:space="preserve">O elemento decisivo é, assim, o acordo de 11-05-2020 e a extensão temporal da suspensão que desencadeou. Na primeira leitura, a obrigação prescreveu no início de dezembro de 2025; na segunda, o prazo permanece suspenso até hoje. Este Gabinete não pode, com segurança, dar prevalência a uma das leituras, na ausência de orientação jurisprudencial uniformizada sobre o ponto.</w:t>
+        <w:t xml:space="preserve">O elemento decisivo é, assim, o acordo de 11-05-2020 e a extensão temporal da suspensão que desencadeou. Na primeira leitura, a obrigação prescreveu em meados de outubro de 2025; na segunda, o prazo permanece suspenso até hoje. Este Gabinete não pode, com segurança, dar prevalência a uma das leituras, na ausência de orientação jurisprudencial uniformizada sobre o ponto.</w:t>
       </w:r>
     </w:p>
     <w:bookmarkEnd w:id="33"/>
@@ -1295,7 +1295,7 @@
         <w:t xml:space="preserve"> </w:t>
       </w:r>
       <w:r>
-        <w:t xml:space="preserve">desde o início de dezembro de 2025, e a instauração de execução fiscal exporia a UVV a oposição com provável procedência;</w:t>
+        <w:t xml:space="preserve">desde meados de outubro de 2025, e a instauração de execução fiscal exporia a UVV a oposição com provável procedência;</w:t>
       </w:r>
     </w:p>
     <w:p>

</xml_diff>